<commit_message>
seller and buyer role system
</commit_message>
<xml_diff>
--- a/Դիպլոմային.docx
+++ b/Դիպլոմային.docx
@@ -26,13 +26,14 @@
     <w:p>
       <w:pPr>
         <w:pStyle w:val="NormalWeb"/>
+        <w:tabs>
+          <w:tab w:val="left" w:pos="1530"/>
+        </w:tabs>
         <w:spacing w:line="36" w:lineRule="atLeast"/>
-        <w:ind w:firstLine="426"/>
+        <w:ind w:left="90" w:right="180" w:firstLine="90"/>
         <w:jc w:val="both"/>
         <w:rPr>
           <w:rFonts w:ascii="Sylfaen" w:hAnsi="Sylfaen"/>
-          <w:b/>
-          <w:bCs/>
           <w:lang w:val="hy-AM"/>
         </w:rPr>
       </w:pPr>
@@ -78,20 +79,21 @@
         </w:rPr>
         <w:t xml:space="preserve"> Մեքենաների որոնման և ֆիլտրացիայի համակարգ, որը հնարավորություն է տալիս հեշտորեն դասակարգել ապրանքները։ Վաճառողի համար կա հարմար ներմուծման էջ, որտեղ բոլոր պետքական տվյալներով պիտի ներմուծվեն վաճառվող մեքենաները, ինչպես նաև կա գնողների ցուցակը, ընտրելու և մերժելու ֆունկցիոնալություն և այլն։</w:t>
       </w:r>
-      <w:r>
-        <w:rPr>
-          <w:rFonts w:ascii="Sylfaen" w:hAnsi="Sylfaen"/>
-          <w:lang w:val="hy-AM"/>
-        </w:rPr>
-        <w:br/>
-      </w:r>
-      <w:r>
-        <w:rPr>
-          <w:rFonts w:ascii="Sylfaen" w:hAnsi="Sylfaen"/>
-          <w:lang w:val="hy-AM"/>
-        </w:rPr>
-        <w:br/>
-      </w:r>
+    </w:p>
+    <w:p>
+      <w:pPr>
+        <w:pStyle w:val="NormalWeb"/>
+        <w:tabs>
+          <w:tab w:val="left" w:pos="1530"/>
+        </w:tabs>
+        <w:spacing w:line="36" w:lineRule="atLeast"/>
+        <w:ind w:left="90" w:right="180" w:hanging="90"/>
+        <w:jc w:val="both"/>
+        <w:rPr>
+          <w:rFonts w:ascii="Sylfaen" w:hAnsi="Sylfaen"/>
+          <w:lang w:val="hy-AM"/>
+        </w:rPr>
+      </w:pPr>
     </w:p>
     <w:p>
       <w:pPr>
@@ -1692,14 +1694,6 @@
           <w:lang w:val="hy-AM" w:eastAsia="ru-RU"/>
         </w:rPr>
         <w:br/>
-      </w:r>
-      <w:r>
-        <w:rPr>
-          <w:rFonts w:ascii="Sylfaen" w:eastAsia="Times New Roman" w:hAnsi="Sylfaen" w:cs="Times New Roman"/>
-          <w:sz w:val="24"/>
-          <w:szCs w:val="24"/>
-          <w:lang w:val="hy-AM" w:eastAsia="ru-RU"/>
-        </w:rPr>
         <w:t>Վեբ բրաուզերը ծրագիր է, որն օգտագործվում է Համացանց մուտք գործելու և դրանից օգտվելու համար։ Երբ օգտատերը որևէ կայքի հասցեով վեբ էջ է մուտք գործում, բրաուզերը ֆայլերը վերցնում է սերվերից և էջը ցուցադրում օգտատիրոջ էկրանին։</w:t>
       </w:r>
     </w:p>
@@ -1847,7 +1841,7 @@
           <w:bCs/>
           <w:sz w:val="36"/>
           <w:szCs w:val="36"/>
-          <w:lang w:eastAsia="ru-RU"/>
+          <w:lang w:val="hy-AM" w:eastAsia="ru-RU"/>
         </w:rPr>
         <w:t>Սերվեր</w:t>
       </w:r>
@@ -2240,7 +2234,7 @@
     <w:sectPr>
       <w:footerReference w:type="default" r:id="rId8"/>
       <w:pgSz w:w="11906" w:h="16838" w:code="9"/>
-      <w:pgMar w:top="1134" w:right="567" w:bottom="1418" w:left="1701" w:header="709" w:footer="709" w:gutter="0"/>
+      <w:pgMar w:top="1134" w:right="926" w:bottom="1418" w:left="1260" w:header="709" w:footer="709" w:gutter="0"/>
       <w:cols w:space="708"/>
       <w:docGrid w:linePitch="360"/>
     </w:sectPr>
@@ -11515,6 +11509,7 @@
   <w:style w:type="character" w:default="1" w:styleId="DefaultParagraphFont">
     <w:name w:val="Default Paragraph Font"/>
     <w:uiPriority w:val="1"/>
+    <w:semiHidden/>
     <w:unhideWhenUsed/>
   </w:style>
   <w:style w:type="table" w:default="1" w:styleId="TableNormal">

</xml_diff>